<commit_message>
Resume: personal projects out, Dreaming Tree in
Co-Authored-By: Claude Opus 5.5 <noreply@anthropic.com>
</commit_message>
<xml_diff>
--- a/assets/docs/funnelmance-resume.docx
+++ b/assets/docs/funnelmance-resume.docx
@@ -1313,7 +1313,7 @@
                 <w:lang w:eastAsia="ko-KR"/>
               </w:rPr>
               <w:br/>
-              <w:t>광고·브랜드 영상 중심 작품 7편 (영상 재생 가능)</w:t>
+              <w:t>광고·브랜드 영상 중심 작품 7편 (개인 작업 STILL·LUNE 포함, 영상 재생 가능)</w:t>
             </w:r>
           </w:p>
         </w:tc>
@@ -3988,7 +3988,7 @@
                 <w:rFonts w:asciiTheme="minorHAnsi" w:eastAsiaTheme="minorHAnsi" w:hAnsiTheme="minorHAnsi"/>
                 <w:sz w:val="18"/>
               </w:rPr>
-              <w:t xml:space="preserve">2026.10</w:t>
+              <w:t>2026.07~08</w:t>
             </w:r>
           </w:p>
         </w:tc>
@@ -4021,7 +4021,7 @@
                 <w:sz w:val="18"/>
                 <w:lang w:eastAsia="ko-KR"/>
               </w:rPr>
-              <w:t xml:space="preserve">STILL 노이즈 캔슬링 헤드폰 AI 광고 / 개인</w:t>
+              <w:t xml:space="preserve">GENTLE MONSTER 레퍼런스 BIO · OCEAN EVOLUTION / 팀 프로젝트(4인)</w:t>
             </w:r>
           </w:p>
           <w:p>
@@ -4051,7 +4051,7 @@
                 <w:sz w:val="18"/>
                 <w:lang w:eastAsia="ko-KR"/>
               </w:rPr>
-              <w:t xml:space="preserve"> 가상 헤드폰 브랜드의 ‘소음 차단 → 몰입’ 가치를 35초 브랜드 광고로 전달</w:t>
+              <w:t xml:space="preserve"> 젠틀몬스터의 브랜드 철학을 참고해 새로운 아이웨어 컬렉션을 제안 (가상 제안 프로젝트)</w:t>
             </w:r>
           </w:p>
           <w:p>
@@ -4081,7 +4081,7 @@
                 <w:sz w:val="18"/>
                 <w:lang w:eastAsia="ko-KR"/>
               </w:rPr>
-              <w:t xml:space="preserve"> 브랜드·제품 기획, AI 이미지·영상 생성, 효과음·음악, 편집</w:t>
+              <w:t xml:space="preserve"> 3D 모델링, 영상 편집</w:t>
             </w:r>
           </w:p>
           <w:p>
@@ -4111,7 +4111,7 @@
                 <w:sz w:val="18"/>
                 <w:lang w:eastAsia="ko-KR"/>
               </w:rPr>
-              <w:t xml:space="preserve"> Higgsfield, ElevenLabs, Suno, Premiere Pro</w:t>
+              <w:t xml:space="preserve"> Cinema 4D, Photoshop</w:t>
             </w:r>
           </w:p>
           <w:p>
@@ -4141,7 +4141,7 @@
                 <w:sz w:val="18"/>
                 <w:lang w:eastAsia="ko-KR"/>
               </w:rPr>
-              <w:t xml:space="preserve"> 제품 시트 설계부터 35초 4K 브랜드 광고까지 1인 완성</w:t>
+              <w:t xml:space="preserve"> 3D 아이웨어 제품 디자인과 제품 필름 2편(Bio 0:49 · Ocean 0:30) 완성</w:t>
             </w:r>
           </w:p>
           <w:p>
@@ -4171,7 +4171,451 @@
                 <w:sz w:val="18"/>
                 <w:lang w:eastAsia="ko-KR"/>
               </w:rPr>
-              <w:t xml:space="preserve"> 제품 시트를 먼저 설계해 모든 장면의 기준으로 삼고, 착용 전의 빠른 컷과 착용 후의 긴 호흡, 소음에서 피아노로 바뀌는 사운드로 몰입의 순간을 표현</w:t>
+              <w:t xml:space="preserve"> Cinema 4D로 제품을 모델링하고, 편집에서 고치·세포 장면으로 궁금증을 만든 뒤 제품 리빌과 렌즈·브리지·측면 곡선 디테일 컷으로 제품 특징을 강조</w:t>
+            </w:r>
+          </w:p>
+        </w:tc>
+      </w:tr>
+      <w:tr>
+        <w:trPr>
+          <w:trHeight w:val="734"/>
+        </w:trPr>
+        <w:tc>
+          <w:tcPr>
+            <w:tcW w:w="1937" w:type="dxa"/>
+            <w:tcBorders>
+              <w:top w:val="single" w:sz="3" w:space="0" w:color="4BACC6"/>
+              <w:left w:val="single" w:sz="3" w:space="0" w:color="4BACC6"/>
+              <w:bottom w:val="single" w:sz="3" w:space="0" w:color="4BACC6"/>
+              <w:right w:val="single" w:sz="3" w:space="0" w:color="4BACC6"/>
+            </w:tcBorders>
+            <w:shd w:val="clear" w:color="auto" w:fill="FFFFFF"/>
+            <w:vAlign w:val="center"/>
+          </w:tcPr>
+          <w:p>
+            <w:pPr>
+              <w:pStyle w:val="a9"/>
+              <w:wordWrap/>
+              <w:spacing w:line="252" w:lineRule="auto"/>
+              <w:jc w:val="center"/>
+              <w:rPr>
+                <w:rFonts w:asciiTheme="minorHAnsi" w:eastAsiaTheme="minorHAnsi" w:hAnsiTheme="minorHAnsi"/>
+                <w:lang w:eastAsia="ko-KR"/>
+              </w:rPr>
+            </w:pPr>
+            <w:r>
+              <w:rPr>
+                <w:rFonts w:asciiTheme="minorHAnsi" w:eastAsiaTheme="minorHAnsi" w:hAnsiTheme="minorHAnsi" w:hint="eastAsia"/>
+                <w:sz w:val="18"/>
+                <w:lang w:eastAsia="ko-KR"/>
+              </w:rPr>
+              <w:t>2026.05</w:t>
+            </w:r>
+          </w:p>
+        </w:tc>
+        <w:tc>
+          <w:tcPr>
+            <w:tcW w:w="8232" w:type="dxa"/>
+            <w:tcBorders>
+              <w:top w:val="single" w:sz="3" w:space="0" w:color="4BACC6"/>
+              <w:left w:val="single" w:sz="3" w:space="0" w:color="4BACC6"/>
+              <w:bottom w:val="single" w:sz="3" w:space="0" w:color="4BACC6"/>
+              <w:right w:val="single" w:sz="3" w:space="0" w:color="4BACC6"/>
+            </w:tcBorders>
+            <w:shd w:val="clear" w:color="auto" w:fill="FFFFFF"/>
+            <w:vAlign w:val="center"/>
+          </w:tcPr>
+          <w:p>
+            <w:pPr>
+              <w:pStyle w:val="a9"/>
+              <w:spacing w:line="252" w:lineRule="auto"/>
+              <w:ind w:left="100" w:right="100"/>
+              <w:rPr>
+                <w:rFonts w:asciiTheme="minorHAnsi" w:eastAsiaTheme="minorHAnsi" w:hAnsiTheme="minorHAnsi"/>
+                <w:lang w:eastAsia="ko-KR"/>
+              </w:rPr>
+            </w:pPr>
+            <w:r>
+              <w:rPr>
+                <w:rFonts w:asciiTheme="minorHAnsi" w:eastAsiaTheme="minorHAnsi" w:hAnsiTheme="minorHAnsi" w:hint="eastAsia"/>
+                <w:b/>
+                <w:sz w:val="18"/>
+                <w:lang w:eastAsia="ko-KR"/>
+              </w:rPr>
+              <w:t xml:space="preserve">2026 여주 AI 뮤직비디오 공모전 / 팀 프로젝트(5인)</w:t>
+            </w:r>
+          </w:p>
+          <w:p>
+            <w:pPr>
+              <w:pStyle w:val="a9"/>
+              <w:spacing w:line="252" w:lineRule="auto"/>
+              <w:ind w:left="100" w:right="100"/>
+              <w:rPr>
+                <w:rFonts w:asciiTheme="minorHAnsi" w:eastAsiaTheme="minorHAnsi" w:hAnsiTheme="minorHAnsi"/>
+                <w:lang w:eastAsia="ko-KR"/>
+              </w:rPr>
+            </w:pPr>
+            <w:r>
+              <w:rPr>
+                <w:rFonts w:asciiTheme="minorHAnsi" w:eastAsiaTheme="minorHAnsi" w:hAnsiTheme="minorHAnsi" w:hint="eastAsia"/>
+                <w:b/>
+                <w:bCs/>
+                <w:sz w:val="18"/>
+                <w:lang w:eastAsia="ko-KR"/>
+              </w:rPr>
+              <w:t xml:space="preserve">목적:</w:t>
+            </w:r>
+            <w:r>
+              <w:rPr>
+                <w:rFonts w:asciiTheme="minorHAnsi" w:eastAsiaTheme="minorHAnsi" w:hAnsiTheme="minorHAnsi" w:hint="eastAsia"/>
+                <w:color w:val="404040"/>
+                <w:sz w:val="18"/>
+                <w:lang w:eastAsia="ko-KR"/>
+              </w:rPr>
+              <w:t xml:space="preserve"> 여주의 역사, 문화, 자연, 관광자원을 활용한 자유 주제이며 여주시 홍보를 위함</w:t>
+            </w:r>
+          </w:p>
+          <w:p>
+            <w:pPr>
+              <w:pStyle w:val="a9"/>
+              <w:spacing w:line="252" w:lineRule="auto"/>
+              <w:ind w:left="100" w:right="100"/>
+              <w:rPr>
+                <w:rFonts w:asciiTheme="minorHAnsi" w:eastAsiaTheme="minorHAnsi" w:hAnsiTheme="minorHAnsi"/>
+                <w:lang w:eastAsia="ko-KR"/>
+              </w:rPr>
+            </w:pPr>
+            <w:r>
+              <w:rPr>
+                <w:rFonts w:asciiTheme="minorHAnsi" w:eastAsiaTheme="minorHAnsi" w:hAnsiTheme="minorHAnsi" w:hint="eastAsia"/>
+                <w:b/>
+                <w:bCs/>
+                <w:sz w:val="18"/>
+                <w:lang w:eastAsia="ko-KR"/>
+              </w:rPr>
+              <w:t xml:space="preserve">역할:</w:t>
+            </w:r>
+            <w:r>
+              <w:rPr>
+                <w:rFonts w:asciiTheme="minorHAnsi" w:eastAsiaTheme="minorHAnsi" w:hAnsiTheme="minorHAnsi" w:hint="eastAsia"/>
+                <w:color w:val="404040"/>
+                <w:sz w:val="18"/>
+                <w:lang w:eastAsia="ko-KR"/>
+              </w:rPr>
+              <w:t xml:space="preserve"> AI 이미지 생성, 영상 편집</w:t>
+            </w:r>
+          </w:p>
+          <w:p>
+            <w:pPr>
+              <w:pStyle w:val="a9"/>
+              <w:spacing w:line="252" w:lineRule="auto"/>
+              <w:ind w:left="100" w:right="100"/>
+              <w:rPr>
+                <w:rFonts w:asciiTheme="minorHAnsi" w:eastAsiaTheme="minorHAnsi" w:hAnsiTheme="minorHAnsi"/>
+                <w:lang w:eastAsia="ko-KR"/>
+              </w:rPr>
+            </w:pPr>
+            <w:r>
+              <w:rPr>
+                <w:rFonts w:asciiTheme="minorHAnsi" w:eastAsiaTheme="minorHAnsi" w:hAnsiTheme="minorHAnsi" w:hint="eastAsia"/>
+                <w:b/>
+                <w:bCs/>
+                <w:sz w:val="18"/>
+                <w:lang w:eastAsia="ko-KR"/>
+              </w:rPr>
+              <w:t xml:space="preserve">툴:</w:t>
+            </w:r>
+            <w:r>
+              <w:rPr>
+                <w:rFonts w:asciiTheme="minorHAnsi" w:eastAsiaTheme="minorHAnsi" w:hAnsiTheme="minorHAnsi" w:hint="eastAsia"/>
+                <w:color w:val="404040"/>
+                <w:sz w:val="18"/>
+                <w:lang w:eastAsia="ko-KR"/>
+              </w:rPr>
+              <w:t xml:space="preserve"> ChatGPT, Gemini, Midjourney, Google Flow, Photoshop, Premiere Pro</w:t>
+            </w:r>
+          </w:p>
+          <w:p>
+            <w:pPr>
+              <w:pStyle w:val="a9"/>
+              <w:spacing w:line="252" w:lineRule="auto"/>
+              <w:ind w:left="100" w:right="100"/>
+              <w:rPr>
+                <w:rFonts w:asciiTheme="minorHAnsi" w:eastAsiaTheme="minorHAnsi" w:hAnsiTheme="minorHAnsi"/>
+                <w:lang w:eastAsia="ko-KR"/>
+              </w:rPr>
+            </w:pPr>
+            <w:r>
+              <w:rPr>
+                <w:rFonts w:asciiTheme="minorHAnsi" w:eastAsiaTheme="minorHAnsi" w:hAnsiTheme="minorHAnsi" w:hint="eastAsia"/>
+                <w:b/>
+                <w:bCs/>
+                <w:sz w:val="18"/>
+                <w:lang w:eastAsia="ko-KR"/>
+              </w:rPr>
+              <w:t xml:space="preserve">성과:</w:t>
+            </w:r>
+            <w:r>
+              <w:rPr>
+                <w:rFonts w:asciiTheme="minorHAnsi" w:eastAsiaTheme="minorHAnsi" w:hAnsiTheme="minorHAnsi" w:hint="eastAsia"/>
+                <w:color w:val="404040"/>
+                <w:sz w:val="18"/>
+                <w:lang w:eastAsia="ko-KR"/>
+              </w:rPr>
+              <w:t xml:space="preserve"> 여주의 역사·문화·관광자원을 AI 뮤직비디오로 재구성한 홍보 영상 완성 (공모전 본선진출)</w:t>
+            </w:r>
+          </w:p>
+          <w:p>
+            <w:pPr>
+              <w:pStyle w:val="a9"/>
+              <w:spacing w:line="252" w:lineRule="auto"/>
+              <w:ind w:left="100" w:right="100"/>
+              <w:rPr>
+                <w:rFonts w:asciiTheme="minorHAnsi" w:eastAsiaTheme="minorHAnsi" w:hAnsiTheme="minorHAnsi"/>
+                <w:lang w:eastAsia="ko-KR"/>
+              </w:rPr>
+            </w:pPr>
+            <w:r>
+              <w:rPr>
+                <w:rFonts w:asciiTheme="minorHAnsi" w:eastAsiaTheme="minorHAnsi" w:hAnsiTheme="minorHAnsi" w:hint="eastAsia"/>
+                <w:b/>
+                <w:bCs/>
+                <w:sz w:val="18"/>
+                <w:lang w:eastAsia="ko-KR"/>
+              </w:rPr>
+              <w:t xml:space="preserve">기여:</w:t>
+            </w:r>
+            <w:r>
+              <w:rPr>
+                <w:rFonts w:asciiTheme="minorHAnsi" w:eastAsiaTheme="minorHAnsi" w:hAnsiTheme="minorHAnsi" w:hint="eastAsia"/>
+                <w:color w:val="404040"/>
+                <w:sz w:val="18"/>
+                <w:lang w:eastAsia="ko-KR"/>
+              </w:rPr>
+              <w:t xml:space="preserve"> 세종대왕 모티브의 인플루언서 캐릭터 '종대'와 장면 이미지를 레퍼런스 기반으로 생성하고, 수묵에서 채색으로 넘어가는 흐름에 맞춰 영상을 편집</w:t>
+            </w:r>
+          </w:p>
+        </w:tc>
+      </w:tr>
+      <w:tr>
+        <w:trPr>
+          <w:trHeight w:val="734"/>
+        </w:trPr>
+        <w:tc>
+          <w:tcPr>
+            <w:tcW w:w="1937" w:type="dxa"/>
+            <w:tcBorders>
+              <w:top w:val="single" w:sz="3" w:space="0" w:color="4BACC6"/>
+              <w:left w:val="single" w:sz="3" w:space="0" w:color="4BACC6"/>
+              <w:bottom w:val="single" w:sz="3" w:space="0" w:color="4BACC6"/>
+              <w:right w:val="single" w:sz="3" w:space="0" w:color="4BACC6"/>
+            </w:tcBorders>
+            <w:shd w:val="clear" w:color="auto" w:fill="FFFFFF"/>
+            <w:vAlign w:val="center"/>
+          </w:tcPr>
+          <w:p>
+            <w:pPr>
+              <w:pStyle w:val="a9"/>
+              <w:wordWrap/>
+              <w:spacing w:line="252" w:lineRule="auto"/>
+              <w:jc w:val="center"/>
+              <w:rPr>
+                <w:rFonts w:asciiTheme="minorHAnsi" w:eastAsiaTheme="minorHAnsi" w:hAnsiTheme="minorHAnsi"/>
+                <w:lang w:eastAsia="ko-KR"/>
+              </w:rPr>
+            </w:pPr>
+            <w:r>
+              <w:rPr>
+                <w:rFonts w:asciiTheme="minorHAnsi" w:eastAsiaTheme="minorHAnsi" w:hAnsiTheme="minorHAnsi" w:hint="eastAsia"/>
+                <w:sz w:val="18"/>
+                <w:lang w:eastAsia="ko-KR"/>
+              </w:rPr>
+              <w:t xml:space="preserve">2026.05~06</w:t>
+            </w:r>
+          </w:p>
+        </w:tc>
+        <w:tc>
+          <w:tcPr>
+            <w:tcW w:w="8232" w:type="dxa"/>
+            <w:tcBorders>
+              <w:top w:val="single" w:sz="3" w:space="0" w:color="4BACC6"/>
+              <w:left w:val="single" w:sz="3" w:space="0" w:color="4BACC6"/>
+              <w:bottom w:val="single" w:sz="3" w:space="0" w:color="4BACC6"/>
+              <w:right w:val="single" w:sz="3" w:space="0" w:color="4BACC6"/>
+            </w:tcBorders>
+            <w:shd w:val="clear" w:color="auto" w:fill="FFFFFF"/>
+            <w:vAlign w:val="center"/>
+          </w:tcPr>
+          <w:p>
+            <w:pPr>
+              <w:pStyle w:val="a9"/>
+              <w:spacing w:line="252" w:lineRule="auto"/>
+              <w:ind w:left="100" w:right="100"/>
+              <w:rPr>
+                <w:rFonts w:asciiTheme="minorHAnsi" w:eastAsiaTheme="minorHAnsi" w:hAnsiTheme="minorHAnsi"/>
+                <w:lang w:eastAsia="ko-KR"/>
+              </w:rPr>
+            </w:pPr>
+            <w:r>
+              <w:rPr>
+                <w:rFonts w:asciiTheme="minorHAnsi" w:eastAsiaTheme="minorHAnsi" w:hAnsiTheme="minorHAnsi" w:hint="eastAsia"/>
+                <w:b/>
+                <w:sz w:val="18"/>
+                <w:lang w:eastAsia="ko-KR"/>
+              </w:rPr>
+              <w:t xml:space="preserve">2026 ACC 민주인권평화 영상(+AI) 콘텐츠 공모전 / 팀 프로젝트(5인)</w:t>
+            </w:r>
+          </w:p>
+          <w:p>
+            <w:pPr>
+              <w:pStyle w:val="a9"/>
+              <w:spacing w:line="252" w:lineRule="auto"/>
+              <w:ind w:left="100" w:right="100"/>
+              <w:rPr>
+                <w:rFonts w:asciiTheme="minorHAnsi" w:eastAsiaTheme="minorHAnsi" w:hAnsiTheme="minorHAnsi"/>
+                <w:lang w:eastAsia="ko-KR"/>
+              </w:rPr>
+            </w:pPr>
+            <w:r>
+              <w:rPr>
+                <w:rFonts w:asciiTheme="minorHAnsi" w:eastAsiaTheme="minorHAnsi" w:hAnsiTheme="minorHAnsi" w:hint="eastAsia"/>
+                <w:b/>
+                <w:bCs/>
+                <w:sz w:val="18"/>
+                <w:lang w:eastAsia="ko-KR"/>
+              </w:rPr>
+              <w:t xml:space="preserve">목적:</w:t>
+            </w:r>
+            <w:r>
+              <w:rPr>
+                <w:rFonts w:asciiTheme="minorHAnsi" w:eastAsiaTheme="minorHAnsi" w:hAnsiTheme="minorHAnsi" w:hint="eastAsia"/>
+                <w:color w:val="404040"/>
+                <w:sz w:val="18"/>
+                <w:lang w:eastAsia="ko-KR"/>
+              </w:rPr>
+              <w:t xml:space="preserve"> 민주화 운동이라는 역사적 주제를 미래적 세계관과 결합하여 새로운 방식으로 전달</w:t>
+            </w:r>
+          </w:p>
+          <w:p>
+            <w:pPr>
+              <w:pStyle w:val="a9"/>
+              <w:spacing w:line="252" w:lineRule="auto"/>
+              <w:ind w:left="100" w:right="100"/>
+              <w:rPr>
+                <w:rFonts w:asciiTheme="minorHAnsi" w:eastAsiaTheme="minorHAnsi" w:hAnsiTheme="minorHAnsi"/>
+                <w:lang w:eastAsia="ko-KR"/>
+              </w:rPr>
+            </w:pPr>
+            <w:r>
+              <w:rPr>
+                <w:rFonts w:asciiTheme="minorHAnsi" w:eastAsiaTheme="minorHAnsi" w:hAnsiTheme="minorHAnsi" w:hint="eastAsia"/>
+                <w:b/>
+                <w:bCs/>
+                <w:sz w:val="18"/>
+                <w:lang w:eastAsia="ko-KR"/>
+              </w:rPr>
+              <w:t xml:space="preserve">역할:</w:t>
+            </w:r>
+            <w:r>
+              <w:rPr>
+                <w:rFonts w:asciiTheme="minorHAnsi" w:eastAsiaTheme="minorHAnsi" w:hAnsiTheme="minorHAnsi" w:hint="eastAsia"/>
+                <w:color w:val="404040"/>
+                <w:sz w:val="18"/>
+                <w:lang w:eastAsia="ko-KR"/>
+              </w:rPr>
+              <w:t xml:space="preserve"> AI 이미지 생성, 캐릭터 보이스 생성, 영상 편집</w:t>
+            </w:r>
+          </w:p>
+          <w:p>
+            <w:pPr>
+              <w:pStyle w:val="a9"/>
+              <w:spacing w:line="252" w:lineRule="auto"/>
+              <w:ind w:left="100" w:right="100"/>
+              <w:rPr>
+                <w:rFonts w:asciiTheme="minorHAnsi" w:eastAsiaTheme="minorHAnsi" w:hAnsiTheme="minorHAnsi"/>
+                <w:lang w:eastAsia="ko-KR"/>
+              </w:rPr>
+            </w:pPr>
+            <w:r>
+              <w:rPr>
+                <w:rFonts w:asciiTheme="minorHAnsi" w:eastAsiaTheme="minorHAnsi" w:hAnsiTheme="minorHAnsi" w:hint="eastAsia"/>
+                <w:b/>
+                <w:bCs/>
+                <w:sz w:val="18"/>
+                <w:lang w:eastAsia="ko-KR"/>
+              </w:rPr>
+              <w:t xml:space="preserve">툴:</w:t>
+            </w:r>
+            <w:r>
+              <w:rPr>
+                <w:rFonts w:asciiTheme="minorHAnsi" w:eastAsiaTheme="minorHAnsi" w:hAnsiTheme="minorHAnsi" w:hint="eastAsia"/>
+                <w:color w:val="404040"/>
+                <w:sz w:val="18"/>
+                <w:lang w:eastAsia="ko-KR"/>
+              </w:rPr>
+              <w:t xml:space="preserve"> ChatGPT, Gemini, Higgsfield, Google Flow, Photoshop, Premiere Pro, After Effects</w:t>
+            </w:r>
+          </w:p>
+          <w:p>
+            <w:pPr>
+              <w:pStyle w:val="a9"/>
+              <w:spacing w:line="252" w:lineRule="auto"/>
+              <w:ind w:left="100" w:right="100"/>
+              <w:rPr>
+                <w:rFonts w:asciiTheme="minorHAnsi" w:eastAsiaTheme="minorHAnsi" w:hAnsiTheme="minorHAnsi"/>
+                <w:lang w:eastAsia="ko-KR"/>
+              </w:rPr>
+            </w:pPr>
+            <w:r>
+              <w:rPr>
+                <w:rFonts w:asciiTheme="minorHAnsi" w:eastAsiaTheme="minorHAnsi" w:hAnsiTheme="minorHAnsi" w:hint="eastAsia"/>
+                <w:b/>
+                <w:bCs/>
+                <w:sz w:val="18"/>
+                <w:lang w:eastAsia="ko-KR"/>
+              </w:rPr>
+              <w:t xml:space="preserve">성과:</w:t>
+            </w:r>
+            <w:r>
+              <w:rPr>
+                <w:rFonts w:asciiTheme="minorHAnsi" w:eastAsiaTheme="minorHAnsi" w:hAnsiTheme="minorHAnsi" w:hint="eastAsia"/>
+                <w:color w:val="404040"/>
+                <w:sz w:val="18"/>
+                <w:lang w:eastAsia="ko-KR"/>
+              </w:rPr>
+              <w:t xml:space="preserve"> 5·18 민주화운동의 의미를 세대를 잇는 이야기로 재구성한 AI 영상 완성</w:t>
+              <w:br/>
+              <w:t xml:space="preserve">(공모전 본선진출)</w:t>
+            </w:r>
+          </w:p>
+          <w:p>
+            <w:pPr>
+              <w:pStyle w:val="a9"/>
+              <w:spacing w:line="252" w:lineRule="auto"/>
+              <w:ind w:left="100" w:right="100"/>
+              <w:rPr>
+                <w:rFonts w:asciiTheme="minorHAnsi" w:eastAsiaTheme="minorHAnsi" w:hAnsiTheme="minorHAnsi"/>
+                <w:lang w:eastAsia="ko-KR"/>
+              </w:rPr>
+            </w:pPr>
+            <w:r>
+              <w:rPr>
+                <w:rFonts w:asciiTheme="minorHAnsi" w:eastAsiaTheme="minorHAnsi" w:hAnsiTheme="minorHAnsi" w:hint="eastAsia"/>
+                <w:b/>
+                <w:bCs/>
+                <w:sz w:val="18"/>
+                <w:lang w:eastAsia="ko-KR"/>
+              </w:rPr>
+              <w:t xml:space="preserve">기여:</w:t>
+            </w:r>
+            <w:r>
+              <w:rPr>
+                <w:rFonts w:asciiTheme="minorHAnsi" w:eastAsiaTheme="minorHAnsi" w:hAnsiTheme="minorHAnsi" w:hint="eastAsia"/>
+                <w:color w:val="404040"/>
+                <w:sz w:val="18"/>
+                <w:lang w:eastAsia="ko-KR"/>
+              </w:rPr>
+              <w:t xml:space="preserve"> 주인공 '유아', AI 기억 복원 시스템 'ARCHIVE-0', ACC 안내 로봇 등 캐릭터·장면 이미지를 AI로 생성하고, 등장인물 대사 AI 음성 제작과 영상 편집을 담당</w:t>
             </w:r>
           </w:p>
         </w:tc>
@@ -4208,7 +4652,7 @@
                 <w:rFonts w:asciiTheme="minorHAnsi" w:eastAsiaTheme="minorHAnsi" w:hAnsiTheme="minorHAnsi"/>
                 <w:sz w:val="18"/>
               </w:rPr>
-              <w:t>2026.07~08</w:t>
+              <w:t xml:space="preserve">2026.09~10</w:t>
             </w:r>
           </w:p>
         </w:tc>
@@ -4241,7 +4685,7 @@
                 <w:sz w:val="18"/>
                 <w:lang w:eastAsia="ko-KR"/>
               </w:rPr>
-              <w:t xml:space="preserve">GENTLE MONSTER 레퍼런스 BIO · OCEAN EVOLUTION / 팀 프로젝트(4인)</w:t>
+              <w:t xml:space="preserve">DREAMING TREE — Unreal Engine 3D 시네마틱 / 팀 프로젝트(4인, 팀장)</w:t>
             </w:r>
           </w:p>
           <w:p>
@@ -4271,7 +4715,7 @@
                 <w:sz w:val="18"/>
                 <w:lang w:eastAsia="ko-KR"/>
               </w:rPr>
-              <w:t xml:space="preserve"> 젠틀몬스터의 브랜드 철학을 참고해 새로운 아이웨어 컬렉션을 제안 (가상 제안 프로젝트)</w:t>
+              <w:t xml:space="preserve"> 메타버스 체험형 전시용으로, 거대한 나무 안의 정원과 오르골 무대를 탐험하는 3D 시네마틱 제작</w:t>
             </w:r>
           </w:p>
           <w:p>
@@ -4301,7 +4745,7 @@
                 <w:sz w:val="18"/>
                 <w:lang w:eastAsia="ko-KR"/>
               </w:rPr>
-              <w:t xml:space="preserve"> 3D 모델링, 영상 편집</w:t>
+              <w:t xml:space="preserve"> 팀장(일정 관리·작업 분배), Niagara 이펙트 초안, AI 소품·사운드 제작</w:t>
             </w:r>
           </w:p>
           <w:p>
@@ -4331,7 +4775,7 @@
                 <w:sz w:val="18"/>
                 <w:lang w:eastAsia="ko-KR"/>
               </w:rPr>
-              <w:t xml:space="preserve"> Cinema 4D, Photoshop</w:t>
+              <w:t xml:space="preserve"> Unreal Engine, Blender, Niagara, Tripo AI, Suno, ElevenLabs, Premiere Pro</w:t>
             </w:r>
           </w:p>
           <w:p>
@@ -4361,7 +4805,7 @@
                 <w:sz w:val="18"/>
                 <w:lang w:eastAsia="ko-KR"/>
               </w:rPr>
-              <w:t xml:space="preserve"> 3D 아이웨어 제품 디자인과 제품 필름 2편(Bio 0:49 · Ocean 0:30) 완성</w:t>
+              <w:t xml:space="preserve"> 오르골 공연장·마켓·숲길 세 공간을 하나의 여정으로 잇는 1분 12초 시네마틱 완성</w:t>
             </w:r>
           </w:p>
           <w:p>
@@ -4391,451 +4835,7 @@
                 <w:sz w:val="18"/>
                 <w:lang w:eastAsia="ko-KR"/>
               </w:rPr>
-              <w:t xml:space="preserve"> Cinema 4D로 제품을 모델링하고, 편집에서 고치·세포 장면으로 궁금증을 만든 뒤 제품 리빌과 렌즈·브리지·측면 곡선 디테일 컷으로 제품 특징을 강조</w:t>
-            </w:r>
-          </w:p>
-        </w:tc>
-      </w:tr>
-      <w:tr>
-        <w:trPr>
-          <w:trHeight w:val="734"/>
-        </w:trPr>
-        <w:tc>
-          <w:tcPr>
-            <w:tcW w:w="1937" w:type="dxa"/>
-            <w:tcBorders>
-              <w:top w:val="single" w:sz="3" w:space="0" w:color="4BACC6"/>
-              <w:left w:val="single" w:sz="3" w:space="0" w:color="4BACC6"/>
-              <w:bottom w:val="single" w:sz="3" w:space="0" w:color="4BACC6"/>
-              <w:right w:val="single" w:sz="3" w:space="0" w:color="4BACC6"/>
-            </w:tcBorders>
-            <w:shd w:val="clear" w:color="auto" w:fill="FFFFFF"/>
-            <w:vAlign w:val="center"/>
-          </w:tcPr>
-          <w:p>
-            <w:pPr>
-              <w:pStyle w:val="a9"/>
-              <w:wordWrap/>
-              <w:spacing w:line="252" w:lineRule="auto"/>
-              <w:jc w:val="center"/>
-              <w:rPr>
-                <w:rFonts w:asciiTheme="minorHAnsi" w:eastAsiaTheme="minorHAnsi" w:hAnsiTheme="minorHAnsi"/>
-                <w:lang w:eastAsia="ko-KR"/>
-              </w:rPr>
-            </w:pPr>
-            <w:r>
-              <w:rPr>
-                <w:rFonts w:asciiTheme="minorHAnsi" w:eastAsiaTheme="minorHAnsi" w:hAnsiTheme="minorHAnsi" w:hint="eastAsia"/>
-                <w:sz w:val="18"/>
-                <w:lang w:eastAsia="ko-KR"/>
-              </w:rPr>
-              <w:t>2026.05</w:t>
-            </w:r>
-          </w:p>
-        </w:tc>
-        <w:tc>
-          <w:tcPr>
-            <w:tcW w:w="8232" w:type="dxa"/>
-            <w:tcBorders>
-              <w:top w:val="single" w:sz="3" w:space="0" w:color="4BACC6"/>
-              <w:left w:val="single" w:sz="3" w:space="0" w:color="4BACC6"/>
-              <w:bottom w:val="single" w:sz="3" w:space="0" w:color="4BACC6"/>
-              <w:right w:val="single" w:sz="3" w:space="0" w:color="4BACC6"/>
-            </w:tcBorders>
-            <w:shd w:val="clear" w:color="auto" w:fill="FFFFFF"/>
-            <w:vAlign w:val="center"/>
-          </w:tcPr>
-          <w:p>
-            <w:pPr>
-              <w:pStyle w:val="a9"/>
-              <w:spacing w:line="252" w:lineRule="auto"/>
-              <w:ind w:left="100" w:right="100"/>
-              <w:rPr>
-                <w:rFonts w:asciiTheme="minorHAnsi" w:eastAsiaTheme="minorHAnsi" w:hAnsiTheme="minorHAnsi"/>
-                <w:lang w:eastAsia="ko-KR"/>
-              </w:rPr>
-            </w:pPr>
-            <w:r>
-              <w:rPr>
-                <w:rFonts w:asciiTheme="minorHAnsi" w:eastAsiaTheme="minorHAnsi" w:hAnsiTheme="minorHAnsi" w:hint="eastAsia"/>
-                <w:b/>
-                <w:sz w:val="18"/>
-                <w:lang w:eastAsia="ko-KR"/>
-              </w:rPr>
-              <w:t xml:space="preserve">2026 여주 AI 뮤직비디오 공모전 / 팀 프로젝트(5인)</w:t>
-            </w:r>
-          </w:p>
-          <w:p>
-            <w:pPr>
-              <w:pStyle w:val="a9"/>
-              <w:spacing w:line="252" w:lineRule="auto"/>
-              <w:ind w:left="100" w:right="100"/>
-              <w:rPr>
-                <w:rFonts w:asciiTheme="minorHAnsi" w:eastAsiaTheme="minorHAnsi" w:hAnsiTheme="minorHAnsi"/>
-                <w:lang w:eastAsia="ko-KR"/>
-              </w:rPr>
-            </w:pPr>
-            <w:r>
-              <w:rPr>
-                <w:rFonts w:asciiTheme="minorHAnsi" w:eastAsiaTheme="minorHAnsi" w:hAnsiTheme="minorHAnsi" w:hint="eastAsia"/>
-                <w:b/>
-                <w:bCs/>
-                <w:sz w:val="18"/>
-                <w:lang w:eastAsia="ko-KR"/>
-              </w:rPr>
-              <w:t xml:space="preserve">목적:</w:t>
-            </w:r>
-            <w:r>
-              <w:rPr>
-                <w:rFonts w:asciiTheme="minorHAnsi" w:eastAsiaTheme="minorHAnsi" w:hAnsiTheme="minorHAnsi" w:hint="eastAsia"/>
-                <w:color w:val="404040"/>
-                <w:sz w:val="18"/>
-                <w:lang w:eastAsia="ko-KR"/>
-              </w:rPr>
-              <w:t xml:space="preserve"> 여주의 역사, 문화, 자연, 관광자원을 활용한 자유 주제이며 여주시 홍보를 위함</w:t>
-            </w:r>
-          </w:p>
-          <w:p>
-            <w:pPr>
-              <w:pStyle w:val="a9"/>
-              <w:spacing w:line="252" w:lineRule="auto"/>
-              <w:ind w:left="100" w:right="100"/>
-              <w:rPr>
-                <w:rFonts w:asciiTheme="minorHAnsi" w:eastAsiaTheme="minorHAnsi" w:hAnsiTheme="minorHAnsi"/>
-                <w:lang w:eastAsia="ko-KR"/>
-              </w:rPr>
-            </w:pPr>
-            <w:r>
-              <w:rPr>
-                <w:rFonts w:asciiTheme="minorHAnsi" w:eastAsiaTheme="minorHAnsi" w:hAnsiTheme="minorHAnsi" w:hint="eastAsia"/>
-                <w:b/>
-                <w:bCs/>
-                <w:sz w:val="18"/>
-                <w:lang w:eastAsia="ko-KR"/>
-              </w:rPr>
-              <w:t xml:space="preserve">역할:</w:t>
-            </w:r>
-            <w:r>
-              <w:rPr>
-                <w:rFonts w:asciiTheme="minorHAnsi" w:eastAsiaTheme="minorHAnsi" w:hAnsiTheme="minorHAnsi" w:hint="eastAsia"/>
-                <w:color w:val="404040"/>
-                <w:sz w:val="18"/>
-                <w:lang w:eastAsia="ko-KR"/>
-              </w:rPr>
-              <w:t xml:space="preserve"> AI 이미지 생성, 영상 편집</w:t>
-            </w:r>
-          </w:p>
-          <w:p>
-            <w:pPr>
-              <w:pStyle w:val="a9"/>
-              <w:spacing w:line="252" w:lineRule="auto"/>
-              <w:ind w:left="100" w:right="100"/>
-              <w:rPr>
-                <w:rFonts w:asciiTheme="minorHAnsi" w:eastAsiaTheme="minorHAnsi" w:hAnsiTheme="minorHAnsi"/>
-                <w:lang w:eastAsia="ko-KR"/>
-              </w:rPr>
-            </w:pPr>
-            <w:r>
-              <w:rPr>
-                <w:rFonts w:asciiTheme="minorHAnsi" w:eastAsiaTheme="minorHAnsi" w:hAnsiTheme="minorHAnsi" w:hint="eastAsia"/>
-                <w:b/>
-                <w:bCs/>
-                <w:sz w:val="18"/>
-                <w:lang w:eastAsia="ko-KR"/>
-              </w:rPr>
-              <w:t xml:space="preserve">툴:</w:t>
-            </w:r>
-            <w:r>
-              <w:rPr>
-                <w:rFonts w:asciiTheme="minorHAnsi" w:eastAsiaTheme="minorHAnsi" w:hAnsiTheme="minorHAnsi" w:hint="eastAsia"/>
-                <w:color w:val="404040"/>
-                <w:sz w:val="18"/>
-                <w:lang w:eastAsia="ko-KR"/>
-              </w:rPr>
-              <w:t xml:space="preserve"> ChatGPT, Gemini, Midjourney, Google Flow, Photoshop, Premiere Pro</w:t>
-            </w:r>
-          </w:p>
-          <w:p>
-            <w:pPr>
-              <w:pStyle w:val="a9"/>
-              <w:spacing w:line="252" w:lineRule="auto"/>
-              <w:ind w:left="100" w:right="100"/>
-              <w:rPr>
-                <w:rFonts w:asciiTheme="minorHAnsi" w:eastAsiaTheme="minorHAnsi" w:hAnsiTheme="minorHAnsi"/>
-                <w:lang w:eastAsia="ko-KR"/>
-              </w:rPr>
-            </w:pPr>
-            <w:r>
-              <w:rPr>
-                <w:rFonts w:asciiTheme="minorHAnsi" w:eastAsiaTheme="minorHAnsi" w:hAnsiTheme="minorHAnsi" w:hint="eastAsia"/>
-                <w:b/>
-                <w:bCs/>
-                <w:sz w:val="18"/>
-                <w:lang w:eastAsia="ko-KR"/>
-              </w:rPr>
-              <w:t xml:space="preserve">성과:</w:t>
-            </w:r>
-            <w:r>
-              <w:rPr>
-                <w:rFonts w:asciiTheme="minorHAnsi" w:eastAsiaTheme="minorHAnsi" w:hAnsiTheme="minorHAnsi" w:hint="eastAsia"/>
-                <w:color w:val="404040"/>
-                <w:sz w:val="18"/>
-                <w:lang w:eastAsia="ko-KR"/>
-              </w:rPr>
-              <w:t xml:space="preserve"> 여주의 역사·문화·관광자원을 AI 뮤직비디오로 재구성한 홍보 영상 완성 (공모전 본선진출)</w:t>
-            </w:r>
-          </w:p>
-          <w:p>
-            <w:pPr>
-              <w:pStyle w:val="a9"/>
-              <w:spacing w:line="252" w:lineRule="auto"/>
-              <w:ind w:left="100" w:right="100"/>
-              <w:rPr>
-                <w:rFonts w:asciiTheme="minorHAnsi" w:eastAsiaTheme="minorHAnsi" w:hAnsiTheme="minorHAnsi"/>
-                <w:lang w:eastAsia="ko-KR"/>
-              </w:rPr>
-            </w:pPr>
-            <w:r>
-              <w:rPr>
-                <w:rFonts w:asciiTheme="minorHAnsi" w:eastAsiaTheme="minorHAnsi" w:hAnsiTheme="minorHAnsi" w:hint="eastAsia"/>
-                <w:b/>
-                <w:bCs/>
-                <w:sz w:val="18"/>
-                <w:lang w:eastAsia="ko-KR"/>
-              </w:rPr>
-              <w:t xml:space="preserve">기여:</w:t>
-            </w:r>
-            <w:r>
-              <w:rPr>
-                <w:rFonts w:asciiTheme="minorHAnsi" w:eastAsiaTheme="minorHAnsi" w:hAnsiTheme="minorHAnsi" w:hint="eastAsia"/>
-                <w:color w:val="404040"/>
-                <w:sz w:val="18"/>
-                <w:lang w:eastAsia="ko-KR"/>
-              </w:rPr>
-              <w:t xml:space="preserve"> 세종대왕 모티브의 인플루언서 캐릭터 '종대'와 장면 이미지를 레퍼런스 기반으로 생성하고, 수묵에서 채색으로 넘어가는 흐름에 맞춰 영상을 편집</w:t>
-            </w:r>
-          </w:p>
-        </w:tc>
-      </w:tr>
-      <w:tr>
-        <w:trPr>
-          <w:trHeight w:val="734"/>
-        </w:trPr>
-        <w:tc>
-          <w:tcPr>
-            <w:tcW w:w="1937" w:type="dxa"/>
-            <w:tcBorders>
-              <w:top w:val="single" w:sz="3" w:space="0" w:color="4BACC6"/>
-              <w:left w:val="single" w:sz="3" w:space="0" w:color="4BACC6"/>
-              <w:bottom w:val="single" w:sz="3" w:space="0" w:color="4BACC6"/>
-              <w:right w:val="single" w:sz="3" w:space="0" w:color="4BACC6"/>
-            </w:tcBorders>
-            <w:shd w:val="clear" w:color="auto" w:fill="FFFFFF"/>
-            <w:vAlign w:val="center"/>
-          </w:tcPr>
-          <w:p>
-            <w:pPr>
-              <w:pStyle w:val="a9"/>
-              <w:wordWrap/>
-              <w:spacing w:line="252" w:lineRule="auto"/>
-              <w:jc w:val="center"/>
-              <w:rPr>
-                <w:rFonts w:asciiTheme="minorHAnsi" w:eastAsiaTheme="minorHAnsi" w:hAnsiTheme="minorHAnsi"/>
-                <w:lang w:eastAsia="ko-KR"/>
-              </w:rPr>
-            </w:pPr>
-            <w:r>
-              <w:rPr>
-                <w:rFonts w:asciiTheme="minorHAnsi" w:eastAsiaTheme="minorHAnsi" w:hAnsiTheme="minorHAnsi" w:hint="eastAsia"/>
-                <w:sz w:val="18"/>
-                <w:lang w:eastAsia="ko-KR"/>
-              </w:rPr>
-              <w:t xml:space="preserve">2026.05~06</w:t>
-            </w:r>
-          </w:p>
-        </w:tc>
-        <w:tc>
-          <w:tcPr>
-            <w:tcW w:w="8232" w:type="dxa"/>
-            <w:tcBorders>
-              <w:top w:val="single" w:sz="3" w:space="0" w:color="4BACC6"/>
-              <w:left w:val="single" w:sz="3" w:space="0" w:color="4BACC6"/>
-              <w:bottom w:val="single" w:sz="3" w:space="0" w:color="4BACC6"/>
-              <w:right w:val="single" w:sz="3" w:space="0" w:color="4BACC6"/>
-            </w:tcBorders>
-            <w:shd w:val="clear" w:color="auto" w:fill="FFFFFF"/>
-            <w:vAlign w:val="center"/>
-          </w:tcPr>
-          <w:p>
-            <w:pPr>
-              <w:pStyle w:val="a9"/>
-              <w:spacing w:line="252" w:lineRule="auto"/>
-              <w:ind w:left="100" w:right="100"/>
-              <w:rPr>
-                <w:rFonts w:asciiTheme="minorHAnsi" w:eastAsiaTheme="minorHAnsi" w:hAnsiTheme="minorHAnsi"/>
-                <w:lang w:eastAsia="ko-KR"/>
-              </w:rPr>
-            </w:pPr>
-            <w:r>
-              <w:rPr>
-                <w:rFonts w:asciiTheme="minorHAnsi" w:eastAsiaTheme="minorHAnsi" w:hAnsiTheme="minorHAnsi" w:hint="eastAsia"/>
-                <w:b/>
-                <w:sz w:val="18"/>
-                <w:lang w:eastAsia="ko-KR"/>
-              </w:rPr>
-              <w:t xml:space="preserve">2026 ACC 민주인권평화 영상(+AI) 콘텐츠 공모전 / 팀 프로젝트(5인)</w:t>
-            </w:r>
-          </w:p>
-          <w:p>
-            <w:pPr>
-              <w:pStyle w:val="a9"/>
-              <w:spacing w:line="252" w:lineRule="auto"/>
-              <w:ind w:left="100" w:right="100"/>
-              <w:rPr>
-                <w:rFonts w:asciiTheme="minorHAnsi" w:eastAsiaTheme="minorHAnsi" w:hAnsiTheme="minorHAnsi"/>
-                <w:lang w:eastAsia="ko-KR"/>
-              </w:rPr>
-            </w:pPr>
-            <w:r>
-              <w:rPr>
-                <w:rFonts w:asciiTheme="minorHAnsi" w:eastAsiaTheme="minorHAnsi" w:hAnsiTheme="minorHAnsi" w:hint="eastAsia"/>
-                <w:b/>
-                <w:bCs/>
-                <w:sz w:val="18"/>
-                <w:lang w:eastAsia="ko-KR"/>
-              </w:rPr>
-              <w:t xml:space="preserve">목적:</w:t>
-            </w:r>
-            <w:r>
-              <w:rPr>
-                <w:rFonts w:asciiTheme="minorHAnsi" w:eastAsiaTheme="minorHAnsi" w:hAnsiTheme="minorHAnsi" w:hint="eastAsia"/>
-                <w:color w:val="404040"/>
-                <w:sz w:val="18"/>
-                <w:lang w:eastAsia="ko-KR"/>
-              </w:rPr>
-              <w:t xml:space="preserve"> 민주화 운동이라는 역사적 주제를 미래적 세계관과 결합하여 새로운 방식으로 전달</w:t>
-            </w:r>
-          </w:p>
-          <w:p>
-            <w:pPr>
-              <w:pStyle w:val="a9"/>
-              <w:spacing w:line="252" w:lineRule="auto"/>
-              <w:ind w:left="100" w:right="100"/>
-              <w:rPr>
-                <w:rFonts w:asciiTheme="minorHAnsi" w:eastAsiaTheme="minorHAnsi" w:hAnsiTheme="minorHAnsi"/>
-                <w:lang w:eastAsia="ko-KR"/>
-              </w:rPr>
-            </w:pPr>
-            <w:r>
-              <w:rPr>
-                <w:rFonts w:asciiTheme="minorHAnsi" w:eastAsiaTheme="minorHAnsi" w:hAnsiTheme="minorHAnsi" w:hint="eastAsia"/>
-                <w:b/>
-                <w:bCs/>
-                <w:sz w:val="18"/>
-                <w:lang w:eastAsia="ko-KR"/>
-              </w:rPr>
-              <w:t xml:space="preserve">역할:</w:t>
-            </w:r>
-            <w:r>
-              <w:rPr>
-                <w:rFonts w:asciiTheme="minorHAnsi" w:eastAsiaTheme="minorHAnsi" w:hAnsiTheme="minorHAnsi" w:hint="eastAsia"/>
-                <w:color w:val="404040"/>
-                <w:sz w:val="18"/>
-                <w:lang w:eastAsia="ko-KR"/>
-              </w:rPr>
-              <w:t xml:space="preserve"> AI 이미지 생성, 캐릭터 보이스 생성, 영상 편집</w:t>
-            </w:r>
-          </w:p>
-          <w:p>
-            <w:pPr>
-              <w:pStyle w:val="a9"/>
-              <w:spacing w:line="252" w:lineRule="auto"/>
-              <w:ind w:left="100" w:right="100"/>
-              <w:rPr>
-                <w:rFonts w:asciiTheme="minorHAnsi" w:eastAsiaTheme="minorHAnsi" w:hAnsiTheme="minorHAnsi"/>
-                <w:lang w:eastAsia="ko-KR"/>
-              </w:rPr>
-            </w:pPr>
-            <w:r>
-              <w:rPr>
-                <w:rFonts w:asciiTheme="minorHAnsi" w:eastAsiaTheme="minorHAnsi" w:hAnsiTheme="minorHAnsi" w:hint="eastAsia"/>
-                <w:b/>
-                <w:bCs/>
-                <w:sz w:val="18"/>
-                <w:lang w:eastAsia="ko-KR"/>
-              </w:rPr>
-              <w:t xml:space="preserve">툴:</w:t>
-            </w:r>
-            <w:r>
-              <w:rPr>
-                <w:rFonts w:asciiTheme="minorHAnsi" w:eastAsiaTheme="minorHAnsi" w:hAnsiTheme="minorHAnsi" w:hint="eastAsia"/>
-                <w:color w:val="404040"/>
-                <w:sz w:val="18"/>
-                <w:lang w:eastAsia="ko-KR"/>
-              </w:rPr>
-              <w:t xml:space="preserve"> ChatGPT, Gemini, Higgsfield, Google Flow, Photoshop, Premiere Pro, After Effects</w:t>
-            </w:r>
-          </w:p>
-          <w:p>
-            <w:pPr>
-              <w:pStyle w:val="a9"/>
-              <w:spacing w:line="252" w:lineRule="auto"/>
-              <w:ind w:left="100" w:right="100"/>
-              <w:rPr>
-                <w:rFonts w:asciiTheme="minorHAnsi" w:eastAsiaTheme="minorHAnsi" w:hAnsiTheme="minorHAnsi"/>
-                <w:lang w:eastAsia="ko-KR"/>
-              </w:rPr>
-            </w:pPr>
-            <w:r>
-              <w:rPr>
-                <w:rFonts w:asciiTheme="minorHAnsi" w:eastAsiaTheme="minorHAnsi" w:hAnsiTheme="minorHAnsi" w:hint="eastAsia"/>
-                <w:b/>
-                <w:bCs/>
-                <w:sz w:val="18"/>
-                <w:lang w:eastAsia="ko-KR"/>
-              </w:rPr>
-              <w:t xml:space="preserve">성과:</w:t>
-            </w:r>
-            <w:r>
-              <w:rPr>
-                <w:rFonts w:asciiTheme="minorHAnsi" w:eastAsiaTheme="minorHAnsi" w:hAnsiTheme="minorHAnsi" w:hint="eastAsia"/>
-                <w:color w:val="404040"/>
-                <w:sz w:val="18"/>
-                <w:lang w:eastAsia="ko-KR"/>
-              </w:rPr>
-              <w:t xml:space="preserve"> 5·18 민주화운동의 의미를 세대를 잇는 이야기로 재구성한 AI 영상 완성</w:t>
-              <w:br/>
-              <w:t xml:space="preserve">(공모전 본선진출)</w:t>
-            </w:r>
-          </w:p>
-          <w:p>
-            <w:pPr>
-              <w:pStyle w:val="a9"/>
-              <w:spacing w:line="252" w:lineRule="auto"/>
-              <w:ind w:left="100" w:right="100"/>
-              <w:rPr>
-                <w:rFonts w:asciiTheme="minorHAnsi" w:eastAsiaTheme="minorHAnsi" w:hAnsiTheme="minorHAnsi"/>
-                <w:lang w:eastAsia="ko-KR"/>
-              </w:rPr>
-            </w:pPr>
-            <w:r>
-              <w:rPr>
-                <w:rFonts w:asciiTheme="minorHAnsi" w:eastAsiaTheme="minorHAnsi" w:hAnsiTheme="minorHAnsi" w:hint="eastAsia"/>
-                <w:b/>
-                <w:bCs/>
-                <w:sz w:val="18"/>
-                <w:lang w:eastAsia="ko-KR"/>
-              </w:rPr>
-              <w:t xml:space="preserve">기여:</w:t>
-            </w:r>
-            <w:r>
-              <w:rPr>
-                <w:rFonts w:asciiTheme="minorHAnsi" w:eastAsiaTheme="minorHAnsi" w:hAnsiTheme="minorHAnsi" w:hint="eastAsia"/>
-                <w:color w:val="404040"/>
-                <w:sz w:val="18"/>
-                <w:lang w:eastAsia="ko-KR"/>
-              </w:rPr>
-              <w:t xml:space="preserve"> 주인공 '유아', AI 기억 복원 시스템 'ARCHIVE-0', ACC 안내 로봇 등 캐릭터·장면 이미지를 AI로 생성하고, 등장인물 대사 AI 음성 제작과 영상 편집을 담당</w:t>
+              <w:t xml:space="preserve"> 5주 일정을 단계별로 나누고 공간 단위로 작업을 분배해 네 명의 파트를 하나의 결과물로 모았고, 폭포·발광 이펙트 초안과 AI 소품·배경음·효과음을 제작</w:t>
             </w:r>
           </w:p>
         </w:tc>

</xml_diff>